<commit_message>
univariate regression analyis task done
</commit_message>
<xml_diff>
--- a/arc/ai/piyush-luitel/maths for data science and ml/learnings.docx
+++ b/arc/ai/piyush-luitel/maths for data science and ml/learnings.docx
@@ -15986,8 +15986,6 @@
         </w:rPr>
         <w:t>xi</w:t>
       </w:r>
-      <w:bookmarkStart w:id="0" w:name="_GoBack"/>
-      <w:bookmarkEnd w:id="0"/>
       <w:r>
         <w:rPr>
           <w:rFonts w:eastAsia="Times New Roman" w:cs="Times New Roman"/>
@@ -21815,7 +21813,7 @@
         </w:rPr>
         <w:drawing>
           <wp:inline distT="0" distB="0" distL="0" distR="0" wp14:anchorId="2E19E5D8" wp14:editId="273BDDA1">
-            <wp:extent cx="5873750" cy="1638935"/>
+            <wp:extent cx="5664200" cy="1638935"/>
             <wp:effectExtent l="0" t="0" r="0" b="0"/>
             <wp:docPr id="9" name="Picture 9"/>
             <wp:cNvGraphicFramePr>
@@ -21837,7 +21835,7 @@
                   <pic:spPr>
                     <a:xfrm>
                       <a:off x="0" y="0"/>
-                      <a:ext cx="5873750" cy="1638935"/>
+                      <a:ext cx="5664200" cy="1638935"/>
                     </a:xfrm>
                     <a:prstGeom prst="rect">
                       <a:avLst/>
@@ -21849,6 +21847,8 @@
           </wp:inline>
         </w:drawing>
       </w:r>
+      <w:bookmarkStart w:id="0" w:name="_GoBack"/>
+      <w:bookmarkEnd w:id="0"/>
     </w:p>
     <w:p>
       <w:pPr>

</xml_diff>